<commit_message>
wiki-brain v1.08  文档格式清理，UI 优化
</commit_message>
<xml_diff>
--- a/test/original/神通数据库优化.docx
+++ b/test/original/神通数据库优化.docx
@@ -45,6 +45,14 @@
           <w:b/>
         </w:rPr>
       </w:pPr>
+      <w:r>
+        <w:rPr>
+          <w:rFonts w:hint="eastAsia" w:ascii="微软雅黑" w:hAnsi="微软雅黑" w:eastAsia="微软雅黑"/>
+          <w:b/>
+          <w:lang w:val="en-US" w:eastAsia="zh-CN"/>
+        </w:rPr>
+        <w:t>一、</w:t>
+      </w:r>
       <w:r>
         <w:rPr>
           <w:rFonts w:hint="eastAsia" w:ascii="微软雅黑" w:hAnsi="微软雅黑" w:eastAsia="微软雅黑"/>
@@ -75,8 +83,6 @@
         </w:rPr>
         <w:t>输出 SQL 执行记录</w:t>
       </w:r>
-      <w:bookmarkStart w:id="0" w:name="_GoBack"/>
-      <w:bookmarkEnd w:id="0"/>
     </w:p>
     <w:p>
       <w:pPr>
@@ -144,7 +150,7 @@
     </w:p>
     <w:tbl>
       <w:tblPr>
-        <w:tblStyle w:val="4"/>
+        <w:tblStyle w:val="3"/>
         <w:tblW w:w="0" w:type="auto"/>
         <w:tblInd w:w="360" w:type="dxa"/>
         <w:tblBorders>
@@ -168,23 +174,6 @@
         <w:gridCol w:w="8630"/>
       </w:tblGrid>
       <w:tr>
-        <w:tblPrEx>
-          <w:tblBorders>
-            <w:top w:val="single" w:color="auto" w:sz="4" w:space="0"/>
-            <w:left w:val="single" w:color="auto" w:sz="4" w:space="0"/>
-            <w:bottom w:val="single" w:color="auto" w:sz="4" w:space="0"/>
-            <w:right w:val="single" w:color="auto" w:sz="4" w:space="0"/>
-            <w:insideH w:val="single" w:color="auto" w:sz="4" w:space="0"/>
-            <w:insideV w:val="single" w:color="auto" w:sz="4" w:space="0"/>
-          </w:tblBorders>
-          <w:shd w:val="clear" w:color="auto" w:fill="F1F1F1" w:themeFill="background1" w:themeFillShade="F2"/>
-          <w:tblCellMar>
-            <w:top w:w="0" w:type="dxa"/>
-            <w:left w:w="108" w:type="dxa"/>
-            <w:bottom w:w="0" w:type="dxa"/>
-            <w:right w:w="108" w:type="dxa"/>
-          </w:tblCellMar>
-        </w:tblPrEx>
         <w:tc>
           <w:tcPr>
             <w:tcW w:w="8630" w:type="dxa"/>
@@ -382,7 +371,7 @@
     </w:p>
     <w:tbl>
       <w:tblPr>
-        <w:tblStyle w:val="4"/>
+        <w:tblStyle w:val="3"/>
         <w:tblW w:w="0" w:type="auto"/>
         <w:tblInd w:w="360" w:type="dxa"/>
         <w:tblBorders>
@@ -405,22 +394,6 @@
         <w:gridCol w:w="9216"/>
       </w:tblGrid>
       <w:tr>
-        <w:tblPrEx>
-          <w:tblBorders>
-            <w:top w:val="single" w:color="auto" w:sz="4" w:space="0"/>
-            <w:left w:val="single" w:color="auto" w:sz="4" w:space="0"/>
-            <w:bottom w:val="single" w:color="auto" w:sz="4" w:space="0"/>
-            <w:right w:val="single" w:color="auto" w:sz="4" w:space="0"/>
-            <w:insideH w:val="single" w:color="auto" w:sz="4" w:space="0"/>
-            <w:insideV w:val="single" w:color="auto" w:sz="4" w:space="0"/>
-          </w:tblBorders>
-          <w:tblCellMar>
-            <w:top w:w="0" w:type="dxa"/>
-            <w:left w:w="108" w:type="dxa"/>
-            <w:bottom w:w="0" w:type="dxa"/>
-            <w:right w:w="108" w:type="dxa"/>
-          </w:tblCellMar>
-        </w:tblPrEx>
         <w:tc>
           <w:tcPr>
             <w:tcW w:w="8630" w:type="dxa"/>
@@ -1546,6 +1519,16 @@
         <w:rPr>
           <w:rFonts w:hint="eastAsia" w:ascii="微软雅黑" w:hAnsi="微软雅黑" w:eastAsia="微软雅黑"/>
           <w:b/>
+          <w:lang w:val="en-US" w:eastAsia="zh-CN"/>
+        </w:rPr>
+        <w:t>二、</w:t>
+      </w:r>
+      <w:bookmarkStart w:id="0" w:name="_GoBack"/>
+      <w:bookmarkEnd w:id="0"/>
+      <w:r>
+        <w:rPr>
+          <w:rFonts w:hint="eastAsia" w:ascii="微软雅黑" w:hAnsi="微软雅黑" w:eastAsia="微软雅黑"/>
+          <w:b/>
         </w:rPr>
         <w:t>数据库设置</w:t>
       </w:r>
@@ -1575,7 +1558,7 @@
     </w:p>
     <w:tbl>
       <w:tblPr>
-        <w:tblStyle w:val="4"/>
+        <w:tblStyle w:val="3"/>
         <w:tblW w:w="0" w:type="auto"/>
         <w:tblInd w:w="360" w:type="dxa"/>
         <w:tblBorders>
@@ -1595,29 +1578,13 @@
         </w:tblCellMar>
       </w:tblPr>
       <w:tblGrid>
-        <w:gridCol w:w="2295"/>
-        <w:gridCol w:w="2290"/>
-        <w:gridCol w:w="1085"/>
-        <w:gridCol w:w="1660"/>
-        <w:gridCol w:w="1660"/>
+        <w:gridCol w:w="2607"/>
+        <w:gridCol w:w="2252"/>
+        <w:gridCol w:w="1078"/>
+        <w:gridCol w:w="1633"/>
+        <w:gridCol w:w="1646"/>
       </w:tblGrid>
       <w:tr>
-        <w:tblPrEx>
-          <w:tblBorders>
-            <w:top w:val="single" w:color="auto" w:sz="4" w:space="0"/>
-            <w:left w:val="single" w:color="auto" w:sz="4" w:space="0"/>
-            <w:bottom w:val="single" w:color="auto" w:sz="4" w:space="0"/>
-            <w:right w:val="single" w:color="auto" w:sz="4" w:space="0"/>
-            <w:insideH w:val="single" w:color="auto" w:sz="4" w:space="0"/>
-            <w:insideV w:val="single" w:color="auto" w:sz="4" w:space="0"/>
-          </w:tblBorders>
-          <w:tblCellMar>
-            <w:top w:w="0" w:type="dxa"/>
-            <w:left w:w="108" w:type="dxa"/>
-            <w:bottom w:w="0" w:type="dxa"/>
-            <w:right w:w="108" w:type="dxa"/>
-          </w:tblCellMar>
-        </w:tblPrEx>
         <w:tc>
           <w:tcPr>
             <w:tcW w:w="2295" w:type="dxa"/>
@@ -1740,22 +1707,6 @@
         </w:tc>
       </w:tr>
       <w:tr>
-        <w:tblPrEx>
-          <w:tblBorders>
-            <w:top w:val="single" w:color="auto" w:sz="4" w:space="0"/>
-            <w:left w:val="single" w:color="auto" w:sz="4" w:space="0"/>
-            <w:bottom w:val="single" w:color="auto" w:sz="4" w:space="0"/>
-            <w:right w:val="single" w:color="auto" w:sz="4" w:space="0"/>
-            <w:insideH w:val="single" w:color="auto" w:sz="4" w:space="0"/>
-            <w:insideV w:val="single" w:color="auto" w:sz="4" w:space="0"/>
-          </w:tblBorders>
-          <w:tblCellMar>
-            <w:top w:w="0" w:type="dxa"/>
-            <w:left w:w="108" w:type="dxa"/>
-            <w:bottom w:w="0" w:type="dxa"/>
-            <w:right w:w="108" w:type="dxa"/>
-          </w:tblCellMar>
-        </w:tblPrEx>
         <w:tc>
           <w:tcPr>
             <w:tcW w:w="2295" w:type="dxa"/>
@@ -1884,22 +1835,6 @@
         </w:tc>
       </w:tr>
       <w:tr>
-        <w:tblPrEx>
-          <w:tblBorders>
-            <w:top w:val="single" w:color="auto" w:sz="4" w:space="0"/>
-            <w:left w:val="single" w:color="auto" w:sz="4" w:space="0"/>
-            <w:bottom w:val="single" w:color="auto" w:sz="4" w:space="0"/>
-            <w:right w:val="single" w:color="auto" w:sz="4" w:space="0"/>
-            <w:insideH w:val="single" w:color="auto" w:sz="4" w:space="0"/>
-            <w:insideV w:val="single" w:color="auto" w:sz="4" w:space="0"/>
-          </w:tblBorders>
-          <w:tblCellMar>
-            <w:top w:w="0" w:type="dxa"/>
-            <w:left w:w="108" w:type="dxa"/>
-            <w:bottom w:w="0" w:type="dxa"/>
-            <w:right w:w="108" w:type="dxa"/>
-          </w:tblCellMar>
-        </w:tblPrEx>
         <w:tc>
           <w:tcPr>
             <w:tcW w:w="2295" w:type="dxa"/>
@@ -2021,22 +1956,6 @@
         </w:tc>
       </w:tr>
       <w:tr>
-        <w:tblPrEx>
-          <w:tblBorders>
-            <w:top w:val="single" w:color="auto" w:sz="4" w:space="0"/>
-            <w:left w:val="single" w:color="auto" w:sz="4" w:space="0"/>
-            <w:bottom w:val="single" w:color="auto" w:sz="4" w:space="0"/>
-            <w:right w:val="single" w:color="auto" w:sz="4" w:space="0"/>
-            <w:insideH w:val="single" w:color="auto" w:sz="4" w:space="0"/>
-            <w:insideV w:val="single" w:color="auto" w:sz="4" w:space="0"/>
-          </w:tblBorders>
-          <w:tblCellMar>
-            <w:top w:w="0" w:type="dxa"/>
-            <w:left w:w="108" w:type="dxa"/>
-            <w:bottom w:w="0" w:type="dxa"/>
-            <w:right w:w="108" w:type="dxa"/>
-          </w:tblCellMar>
-        </w:tblPrEx>
         <w:tc>
           <w:tcPr>
             <w:tcW w:w="2295" w:type="dxa"/>
@@ -2186,22 +2105,6 @@
         </w:tc>
       </w:tr>
       <w:tr>
-        <w:tblPrEx>
-          <w:tblBorders>
-            <w:top w:val="single" w:color="auto" w:sz="4" w:space="0"/>
-            <w:left w:val="single" w:color="auto" w:sz="4" w:space="0"/>
-            <w:bottom w:val="single" w:color="auto" w:sz="4" w:space="0"/>
-            <w:right w:val="single" w:color="auto" w:sz="4" w:space="0"/>
-            <w:insideH w:val="single" w:color="auto" w:sz="4" w:space="0"/>
-            <w:insideV w:val="single" w:color="auto" w:sz="4" w:space="0"/>
-          </w:tblBorders>
-          <w:tblCellMar>
-            <w:top w:w="0" w:type="dxa"/>
-            <w:left w:w="108" w:type="dxa"/>
-            <w:bottom w:w="0" w:type="dxa"/>
-            <w:right w:w="108" w:type="dxa"/>
-          </w:tblCellMar>
-        </w:tblPrEx>
         <w:tc>
           <w:tcPr>
             <w:tcW w:w="2295" w:type="dxa"/>
@@ -2385,7 +2288,7 @@
     </w:p>
     <w:tbl>
       <w:tblPr>
-        <w:tblStyle w:val="4"/>
+        <w:tblStyle w:val="3"/>
         <w:tblW w:w="8995" w:type="dxa"/>
         <w:tblInd w:w="360" w:type="dxa"/>
         <w:tblBorders>
@@ -2405,28 +2308,12 @@
         </w:tblCellMar>
       </w:tblPr>
       <w:tblGrid>
-        <w:gridCol w:w="3185"/>
-        <w:gridCol w:w="3666"/>
-        <w:gridCol w:w="1129"/>
-        <w:gridCol w:w="1015"/>
+        <w:gridCol w:w="3721"/>
+        <w:gridCol w:w="3239"/>
+        <w:gridCol w:w="1046"/>
+        <w:gridCol w:w="989"/>
       </w:tblGrid>
       <w:tr>
-        <w:tblPrEx>
-          <w:tblBorders>
-            <w:top w:val="single" w:color="auto" w:sz="4" w:space="0"/>
-            <w:left w:val="single" w:color="auto" w:sz="4" w:space="0"/>
-            <w:bottom w:val="single" w:color="auto" w:sz="4" w:space="0"/>
-            <w:right w:val="single" w:color="auto" w:sz="4" w:space="0"/>
-            <w:insideH w:val="single" w:color="auto" w:sz="4" w:space="0"/>
-            <w:insideV w:val="single" w:color="auto" w:sz="4" w:space="0"/>
-          </w:tblBorders>
-          <w:tblCellMar>
-            <w:top w:w="0" w:type="dxa"/>
-            <w:left w:w="108" w:type="dxa"/>
-            <w:bottom w:w="0" w:type="dxa"/>
-            <w:right w:w="108" w:type="dxa"/>
-          </w:tblCellMar>
-        </w:tblPrEx>
         <w:tc>
           <w:tcPr>
             <w:tcW w:w="2295" w:type="dxa"/>
@@ -2525,22 +2412,6 @@
         </w:tc>
       </w:tr>
       <w:tr>
-        <w:tblPrEx>
-          <w:tblBorders>
-            <w:top w:val="single" w:color="auto" w:sz="4" w:space="0"/>
-            <w:left w:val="single" w:color="auto" w:sz="4" w:space="0"/>
-            <w:bottom w:val="single" w:color="auto" w:sz="4" w:space="0"/>
-            <w:right w:val="single" w:color="auto" w:sz="4" w:space="0"/>
-            <w:insideH w:val="single" w:color="auto" w:sz="4" w:space="0"/>
-            <w:insideV w:val="single" w:color="auto" w:sz="4" w:space="0"/>
-          </w:tblBorders>
-          <w:tblCellMar>
-            <w:top w:w="0" w:type="dxa"/>
-            <w:left w:w="108" w:type="dxa"/>
-            <w:bottom w:w="0" w:type="dxa"/>
-            <w:right w:w="108" w:type="dxa"/>
-          </w:tblCellMar>
-        </w:tblPrEx>
         <w:tc>
           <w:tcPr>
             <w:tcW w:w="2295" w:type="dxa"/>
@@ -2627,22 +2498,6 @@
         </w:tc>
       </w:tr>
       <w:tr>
-        <w:tblPrEx>
-          <w:tblBorders>
-            <w:top w:val="single" w:color="auto" w:sz="4" w:space="0"/>
-            <w:left w:val="single" w:color="auto" w:sz="4" w:space="0"/>
-            <w:bottom w:val="single" w:color="auto" w:sz="4" w:space="0"/>
-            <w:right w:val="single" w:color="auto" w:sz="4" w:space="0"/>
-            <w:insideH w:val="single" w:color="auto" w:sz="4" w:space="0"/>
-            <w:insideV w:val="single" w:color="auto" w:sz="4" w:space="0"/>
-          </w:tblBorders>
-          <w:tblCellMar>
-            <w:top w:w="0" w:type="dxa"/>
-            <w:left w:w="108" w:type="dxa"/>
-            <w:bottom w:w="0" w:type="dxa"/>
-            <w:right w:w="108" w:type="dxa"/>
-          </w:tblCellMar>
-        </w:tblPrEx>
         <w:tc>
           <w:tcPr>
             <w:tcW w:w="2295" w:type="dxa"/>
@@ -2764,7 +2619,7 @@
     </w:p>
     <w:tbl>
       <w:tblPr>
-        <w:tblStyle w:val="4"/>
+        <w:tblStyle w:val="3"/>
         <w:tblW w:w="8995" w:type="dxa"/>
         <w:tblInd w:w="360" w:type="dxa"/>
         <w:tblBorders>
@@ -2784,20 +2639,10 @@
         </w:tblCellMar>
       </w:tblPr>
       <w:tblGrid>
-        <w:gridCol w:w="1885"/>
-        <w:gridCol w:w="7110"/>
+        <w:gridCol w:w="1913"/>
+        <w:gridCol w:w="7082"/>
       </w:tblGrid>
       <w:tr>
-        <w:tblPrEx>
-          <w:tblBorders>
-            <w:top w:val="single" w:color="auto" w:sz="4" w:space="0"/>
-            <w:left w:val="single" w:color="auto" w:sz="4" w:space="0"/>
-            <w:bottom w:val="single" w:color="auto" w:sz="4" w:space="0"/>
-            <w:right w:val="single" w:color="auto" w:sz="4" w:space="0"/>
-            <w:insideH w:val="single" w:color="auto" w:sz="4" w:space="0"/>
-            <w:insideV w:val="single" w:color="auto" w:sz="4" w:space="0"/>
-          </w:tblBorders>
-        </w:tblPrEx>
         <w:tc>
           <w:tcPr>
             <w:tcW w:w="1885" w:type="dxa"/>
@@ -2848,22 +2693,6 @@
         </w:tc>
       </w:tr>
       <w:tr>
-        <w:tblPrEx>
-          <w:tblBorders>
-            <w:top w:val="single" w:color="auto" w:sz="4" w:space="0"/>
-            <w:left w:val="single" w:color="auto" w:sz="4" w:space="0"/>
-            <w:bottom w:val="single" w:color="auto" w:sz="4" w:space="0"/>
-            <w:right w:val="single" w:color="auto" w:sz="4" w:space="0"/>
-            <w:insideH w:val="single" w:color="auto" w:sz="4" w:space="0"/>
-            <w:insideV w:val="single" w:color="auto" w:sz="4" w:space="0"/>
-          </w:tblBorders>
-          <w:tblCellMar>
-            <w:top w:w="0" w:type="dxa"/>
-            <w:left w:w="108" w:type="dxa"/>
-            <w:bottom w:w="0" w:type="dxa"/>
-            <w:right w:w="108" w:type="dxa"/>
-          </w:tblCellMar>
-        </w:tblPrEx>
         <w:tc>
           <w:tcPr>
             <w:tcW w:w="1885" w:type="dxa"/>
@@ -2980,22 +2809,6 @@
         </w:tc>
       </w:tr>
       <w:tr>
-        <w:tblPrEx>
-          <w:tblBorders>
-            <w:top w:val="single" w:color="auto" w:sz="4" w:space="0"/>
-            <w:left w:val="single" w:color="auto" w:sz="4" w:space="0"/>
-            <w:bottom w:val="single" w:color="auto" w:sz="4" w:space="0"/>
-            <w:right w:val="single" w:color="auto" w:sz="4" w:space="0"/>
-            <w:insideH w:val="single" w:color="auto" w:sz="4" w:space="0"/>
-            <w:insideV w:val="single" w:color="auto" w:sz="4" w:space="0"/>
-          </w:tblBorders>
-          <w:tblCellMar>
-            <w:top w:w="0" w:type="dxa"/>
-            <w:left w:w="108" w:type="dxa"/>
-            <w:bottom w:w="0" w:type="dxa"/>
-            <w:right w:w="108" w:type="dxa"/>
-          </w:tblCellMar>
-        </w:tblPrEx>
         <w:tc>
           <w:tcPr>
             <w:tcW w:w="1885" w:type="dxa"/>
@@ -3211,9 +3024,26 @@
           <w:sz w:val="18"/>
         </w:rPr>
       </w:pPr>
+    </w:p>
+    <w:p>
+      <w:pPr>
+        <w:numPr>
+          <w:ilvl w:val="0"/>
+          <w:numId w:val="2"/>
+        </w:numPr>
+        <w:ind w:left="720" w:leftChars="0" w:hanging="360" w:firstLineChars="0"/>
+        <w:rPr>
+          <w:rFonts w:ascii="Consolas" w:hAnsi="Consolas" w:eastAsia="微软雅黑"/>
+          <w:b/>
+          <w:bCs/>
+          <w:sz w:val="18"/>
+        </w:rPr>
+      </w:pPr>
       <w:r>
         <w:rPr>
           <w:rFonts w:hint="eastAsia" w:ascii="Consolas" w:hAnsi="Consolas" w:eastAsia="微软雅黑"/>
+          <w:b/>
+          <w:bCs/>
           <w:sz w:val="18"/>
         </w:rPr>
         <w:t>开启自动计算统计信息</w:t>
@@ -3801,13 +3631,13 @@
       <w:lang w:val="en-US" w:eastAsia="zh-CN" w:bidi="ar-SA"/>
     </w:rPr>
   </w:style>
-  <w:style w:type="character" w:default="1" w:styleId="2">
+  <w:style w:type="character" w:default="1" w:styleId="4">
     <w:name w:val="Default Paragraph Font"/>
     <w:semiHidden/>
     <w:unhideWhenUsed/>
     <w:uiPriority w:val="1"/>
   </w:style>
-  <w:style w:type="table" w:default="1" w:styleId="3">
+  <w:style w:type="table" w:default="1" w:styleId="2">
     <w:name w:val="Normal Table"/>
     <w:semiHidden/>
     <w:unhideWhenUsed/>
@@ -3821,9 +3651,9 @@
       </w:tblCellMar>
     </w:tblPr>
   </w:style>
-  <w:style w:type="table" w:styleId="4">
+  <w:style w:type="table" w:styleId="3">
     <w:name w:val="Table Grid"/>
-    <w:basedOn w:val="3"/>
+    <w:basedOn w:val="2"/>
     <w:uiPriority w:val="39"/>
     <w:pPr>
       <w:spacing w:after="0" w:line="240" w:lineRule="auto"/>

</xml_diff>